<commit_message>
Tuan01/Bai01/Nén ipynb và docx thành zip
</commit_message>
<xml_diff>
--- a/Tuan01/lab01_Đinh Công Thành_3124411276.docx
+++ b/Tuan01/lab01_Đinh Công Thành_3124411276.docx
@@ -653,7 +653,7 @@
           <w:b/>
           <w:bCs/>
         </w:rPr>
-        <w:t>Trả lời</w:t>
+        <w:t>Nhận xét</w:t>
       </w:r>
       <w:r>
         <w:t>: Tensor a có kích thước (shape) là (2, 3), nghĩa là có 2 hàng và 3 cột. Tensor a có số chiều là 2 (2D). Kiểu dữ liệu của các phần tử là torch.int32, được chỉ định bởi dtype=torch.int32.</w:t>
@@ -829,7 +829,14 @@
           <w:b/>
           <w:bCs/>
         </w:rPr>
-        <w:t xml:space="preserve">Trả lời: </w:t>
+        <w:t>Nhận xét</w:t>
+      </w:r>
+      <w:r>
+        <w:rPr>
+          <w:b/>
+          <w:bCs/>
+        </w:rPr>
+        <w:t xml:space="preserve">: </w:t>
       </w:r>
     </w:p>
     <w:p>
@@ -1048,7 +1055,14 @@
           <w:b/>
           <w:bCs/>
         </w:rPr>
-        <w:t xml:space="preserve">Trả lời: </w:t>
+        <w:t>Nhận xét</w:t>
+      </w:r>
+      <w:r>
+        <w:rPr>
+          <w:b/>
+          <w:bCs/>
+        </w:rPr>
+        <w:t xml:space="preserve">: </w:t>
       </w:r>
       <w:r>
         <w:t>tạo một tensor chứa toàn số 0, gồm 2 khối mỗi khối có 3 hàng và mỗi hàng là 4 phần tử. Như vậy a là là một tensor 3 chiều.</w:t>
@@ -1248,7 +1262,14 @@
           <w:b/>
           <w:bCs/>
         </w:rPr>
-        <w:t>Trả lời:</w:t>
+        <w:t>Nhận xét</w:t>
+      </w:r>
+      <w:r>
+        <w:rPr>
+          <w:b/>
+          <w:bCs/>
+        </w:rPr>
+        <w:t>:</w:t>
       </w:r>
     </w:p>
     <w:p>
@@ -1422,7 +1443,10 @@
     </w:p>
     <w:p>
       <w:r>
-        <w:t>Trả lời:</w:t>
+        <w:t>Nhận xét</w:t>
+      </w:r>
+      <w:r>
+        <w:t>:</w:t>
       </w:r>
     </w:p>
     <w:p>
@@ -1499,16 +1523,7 @@
         <w:ind w:left="0" w:firstLine="720"/>
       </w:pPr>
       <w:r>
-        <w:t xml:space="preserve">Bài </w:t>
-      </w:r>
-      <w:r>
-        <w:t>6</w:t>
-      </w:r>
-      <w:r>
-        <w:t xml:space="preserve">. </w:t>
-      </w:r>
-      <w:r>
-        <w:t>Phép toán và nhân ma trận</w:t>
+        <w:t>Bài 6. Phép toán và nhân ma trận</w:t>
       </w:r>
     </w:p>
     <w:p>
@@ -1627,7 +1642,10 @@
     </w:p>
     <w:p>
       <w:r>
-        <w:t>Trả lời:</w:t>
+        <w:t>Nhận xét</w:t>
+      </w:r>
+      <w:r>
+        <w:t>:</w:t>
       </w:r>
     </w:p>
     <w:p>
@@ -1748,16 +1766,7 @@
         <w:ind w:left="0" w:firstLine="720"/>
       </w:pPr>
       <w:r>
-        <w:t xml:space="preserve">Bài </w:t>
-      </w:r>
-      <w:r>
-        <w:t>7</w:t>
-      </w:r>
-      <w:r>
-        <w:t xml:space="preserve">. </w:t>
-      </w:r>
-      <w:r>
-        <w:t>Các hàm thống kê trên Tensor</w:t>
+        <w:t>Bài 7. Các hàm thống kê trên Tensor</w:t>
       </w:r>
     </w:p>
     <w:p>
@@ -1871,7 +1880,10 @@
     </w:p>
     <w:p>
       <w:r>
-        <w:t>Trả lời:</w:t>
+        <w:t>Nhận xét</w:t>
+      </w:r>
+      <w:r>
+        <w:t>:</w:t>
       </w:r>
     </w:p>
     <w:p>
@@ -2018,16 +2030,7 @@
       </w:pPr>
       <w:r>
         <w:lastRenderedPageBreak/>
-        <w:t xml:space="preserve">Bài </w:t>
-      </w:r>
-      <w:r>
-        <w:t>8</w:t>
-      </w:r>
-      <w:r>
-        <w:t xml:space="preserve">. </w:t>
-      </w:r>
-      <w:r>
-        <w:t>Autograd cơ bản</w:t>
+        <w:t>Bài 8. Autograd cơ bản</w:t>
       </w:r>
     </w:p>
     <w:p>
@@ -2160,7 +2163,10 @@
     </w:p>
     <w:p>
       <w:r>
-        <w:t>Trả lời:</w:t>
+        <w:t>Nhận xét</w:t>
+      </w:r>
+      <w:r>
+        <w:t>:</w:t>
       </w:r>
     </w:p>
     <w:p>
@@ -3075,7 +3081,10 @@
     </w:p>
     <w:p>
       <w:r>
-        <w:t>Trả lời:</w:t>
+        <w:t>Nhận xét</w:t>
+      </w:r>
+      <w:r>
+        <w:t>:</w:t>
       </w:r>
     </w:p>
     <w:tbl>
@@ -3446,9 +3455,6 @@
             <m:t>A+B=9</m:t>
           </m:r>
           <m:r>
-            <w:rPr>
-              <w:i/>
-            </w:rPr>
             <w:br/>
           </m:r>
         </m:oMath>
@@ -3460,9 +3466,6 @@
             <m:t>C-D=1</m:t>
           </m:r>
           <m:r>
-            <w:rPr>
-              <w:i/>
-            </w:rPr>
             <w:br/>
           </m:r>
         </m:oMath>
@@ -3494,9 +3497,6 @@
             <m:t>C=t+1</m:t>
           </m:r>
           <m:r>
-            <w:rPr>
-              <w:i/>
-            </w:rPr>
             <w:br/>
           </m:r>
         </m:oMath>
@@ -3528,9 +3528,6 @@
             <m:t>A=8-C=7-t</m:t>
           </m:r>
           <m:r>
-            <w:rPr>
-              <w:i/>
-            </w:rPr>
             <w:br/>
           </m:r>
         </m:oMath>
@@ -3562,9 +3559,6 @@
             <m:t>B=9-A=2+t</m:t>
           </m:r>
           <m:r>
-            <w:rPr>
-              <w:i/>
-            </w:rPr>
             <w:br/>
           </m:r>
         </m:oMath>
@@ -3586,13 +3580,7 @@
         <w:ind w:firstLine="720"/>
       </w:pPr>
       <w:r>
-        <w:t xml:space="preserve">3. </w:t>
-      </w:r>
-      <w:r>
-        <w:t xml:space="preserve">Bài tập </w:t>
-      </w:r>
-      <w:r>
-        <w:t>áp dụng</w:t>
+        <w:t>3. Bài tập áp dụng</w:t>
       </w:r>
     </w:p>
     <w:p>
@@ -3721,6 +3709,15 @@
       <w:pPr>
         <w:pStyle w:val="BodyText"/>
       </w:pPr>
+      <w:r>
+        <w:t xml:space="preserve">Nhận xét: </w:t>
+      </w:r>
+      <w:r>
+        <w:t>Tra</w:t>
+      </w:r>
+      <w:r>
+        <w:t>Tensor X có 24 phần tử được reshape lần lượt thành 4 × 6, 2 × 12 và 2 × 3 × 4. Kết quả cho thấy việc thay đổi kích thước không làm thay đổi số lượng phần tử của Tensor.</w:t>
+      </w:r>
     </w:p>
     <w:p>
       <w:pPr>
@@ -3887,6 +3884,25 @@
         <w:pStyle w:val="BodyText"/>
       </w:pPr>
       <w:r>
+        <w:t>Nhận xét:</w:t>
+      </w:r>
+    </w:p>
+    <w:p>
+      <w:pPr>
+        <w:pStyle w:val="BodyText"/>
+      </w:pPr>
+      <w:r>
+        <w:t>H</w:t>
+      </w:r>
+      <w:r>
+        <w:t>ai Tensor A và B được tạo với kích thước 3 × 4. Các phép tính A+B, A*B và A/B đều được thực hiện theo từng phần tử. Kết quả độ lệch chuẩn theo cột thu được [4., 4., 4., 4.], phù hợp với dữ liệu được sử dụng trong bài.</w:t>
+      </w:r>
+    </w:p>
+    <w:p>
+      <w:pPr>
+        <w:pStyle w:val="BodyText"/>
+      </w:pPr>
+      <w:r>
         <w:t>Cho y = 2x² + 5x + 3. Dùng autograd tính dy/dx tại x = 2 và kiểm tra bằng phép tính thủ công.</w:t>
       </w:r>
     </w:p>
@@ -4000,6 +4016,18 @@
         <w:pStyle w:val="BodyText"/>
       </w:pPr>
       <w:r>
+        <w:t xml:space="preserve">Nhận xét: </w:t>
+      </w:r>
+      <w:r>
+        <w:t>với hàm y = 2x² + 5x + 3 tại x = 2, chương trình tính được dy/dx = 13. Kết quả này giống với cách tính thủ công: dy/dx = 4x + 5 = 13 khi x = 2. Như vậy phần sử dụng Autograd cho kết quả đúng.</w:t>
+      </w:r>
+    </w:p>
+    <w:p>
+      <w:pPr>
+        <w:pStyle w:val="BodyText"/>
+      </w:pPr>
+      <w:r>
+        <w:lastRenderedPageBreak/>
         <w:t>Thay đa thức trong Bài 9 bằng y = 2x² - 3x + 5; huấn luyện và cho biết các hệ số tìm được.</w:t>
       </w:r>
     </w:p>
@@ -4109,7 +4137,19 @@
         </w:drawing>
       </w:r>
     </w:p>
-    <w:p/>
+    <w:p>
+      <w:r>
+        <w:t>Nhận xét:</w:t>
+      </w:r>
+    </w:p>
+    <w:p>
+      <w:r>
+        <w:t>K</w:t>
+      </w:r>
+      <w:r>
+        <w:t>hi thay đa thức bằng y = 2x² - 3x + 5, các hệ số học được lần lượt là khoảng 2.000006, -3.000006 và 4.999971. Các giá trị này rất gần với hệ số ban đầu là 2, -3 và 5, nên quá trình Gradient Descent đã tìm được nghiệm gần đúng khá tốt.</w:t>
+      </w:r>
+    </w:p>
     <w:sectPr>
       <w:pgSz w:w="11906" w:h="16838"/>
       <w:pgMar w:top="1134" w:right="1134" w:bottom="1134" w:left="1134" w:header="0" w:footer="0" w:gutter="0"/>

</xml_diff>